<commit_message>
planes y manueles actuales sept 2026
</commit_message>
<xml_diff>
--- a/10_Planes/Plan_Migracion_BD_Mercapleno.docx
+++ b/10_Planes/Plan_Migracion_BD_Mercapleno.docx
@@ -2034,182 +2034,6 @@
                 <w:szCs w:val="21"/>
                 <w:rtl w:val="0"/>
               </w:rPr>
-              <w:t xml:space="preserve">MongoDB</w:t>
-            </w:r>
-            <w:r>
-              <w:rPr>
-                <w:rtl w:val="0"/>
-              </w:rPr>
-            </w:r>
-          </w:p>
-        </w:tc>
-        <w:tc>
-          <w:tcPr>
-            <w:tcMar>
-              <w:top w:w="80.0" w:type="dxa"/>
-              <w:left w:w="100.0" w:type="dxa"/>
-              <w:bottom w:w="80.0" w:type="dxa"/>
-              <w:right w:w="100.0" w:type="dxa"/>
-            </w:tcMar>
-          </w:tcPr>
-          <w:p>
-            <w:pPr>
-              <w:rPr>
-                <w:rFonts w:ascii="Arial" w:cs="Arial" w:eastAsia="Arial" w:hAnsi="Arial"/>
-                <w:sz w:val="34"/>
-                <w:szCs w:val="34"/>
-              </w:rPr>
-            </w:pPr>
-            <w:r>
-              <w:rPr>
-                <w:rFonts w:ascii="Arial" w:cs="Arial" w:eastAsia="Arial" w:hAnsi="Arial"/>
-                <w:color w:val="1b1b1b"/>
-                <w:sz w:val="21"/>
-                <w:szCs w:val="21"/>
-                <w:rtl w:val="0"/>
-              </w:rPr>
-              <w:t xml:space="preserve">NoSQL (Documental)</w:t>
-            </w:r>
-            <w:r>
-              <w:rPr>
-                <w:rtl w:val="0"/>
-              </w:rPr>
-            </w:r>
-          </w:p>
-        </w:tc>
-        <w:tc>
-          <w:tcPr>
-            <w:tcMar>
-              <w:top w:w="80.0" w:type="dxa"/>
-              <w:left w:w="100.0" w:type="dxa"/>
-              <w:bottom w:w="80.0" w:type="dxa"/>
-              <w:right w:w="100.0" w:type="dxa"/>
-            </w:tcMar>
-          </w:tcPr>
-          <w:p>
-            <w:pPr>
-              <w:rPr>
-                <w:rFonts w:ascii="Arial" w:cs="Arial" w:eastAsia="Arial" w:hAnsi="Arial"/>
-                <w:sz w:val="34"/>
-                <w:szCs w:val="34"/>
-              </w:rPr>
-            </w:pPr>
-            <w:r>
-              <w:rPr>
-                <w:rFonts w:ascii="Arial" w:cs="Arial" w:eastAsia="Arial" w:hAnsi="Arial"/>
-                <w:color w:val="1b1b1b"/>
-                <w:sz w:val="21"/>
-                <w:szCs w:val="21"/>
-                <w:rtl w:val="0"/>
-              </w:rPr>
-              <w:t xml:space="preserve">Esquema dinámico y flexible; óptimo para catálogos heterogéneos; escalabilidad horizontal automatizada (sharding).</w:t>
-            </w:r>
-            <w:r>
-              <w:rPr>
-                <w:rtl w:val="0"/>
-              </w:rPr>
-            </w:r>
-          </w:p>
-        </w:tc>
-        <w:tc>
-          <w:tcPr>
-            <w:tcMar>
-              <w:top w:w="80.0" w:type="dxa"/>
-              <w:left w:w="100.0" w:type="dxa"/>
-              <w:bottom w:w="80.0" w:type="dxa"/>
-              <w:right w:w="100.0" w:type="dxa"/>
-            </w:tcMar>
-          </w:tcPr>
-          <w:p>
-            <w:pPr>
-              <w:rPr>
-                <w:rFonts w:ascii="Arial" w:cs="Arial" w:eastAsia="Arial" w:hAnsi="Arial"/>
-                <w:sz w:val="34"/>
-                <w:szCs w:val="34"/>
-              </w:rPr>
-            </w:pPr>
-            <w:r>
-              <w:rPr>
-                <w:rFonts w:ascii="Arial" w:cs="Arial" w:eastAsia="Arial" w:hAnsi="Arial"/>
-                <w:color w:val="1b1b1b"/>
-                <w:sz w:val="21"/>
-                <w:szCs w:val="21"/>
-                <w:rtl w:val="0"/>
-              </w:rPr>
-              <w:t xml:space="preserve">Carece de integridad referencial estricta por defecto; transacciones multidocumento costosas; exige reestructurar la lógica de inventario y ventas.</w:t>
-            </w:r>
-            <w:r>
-              <w:rPr>
-                <w:rtl w:val="0"/>
-              </w:rPr>
-            </w:r>
-          </w:p>
-        </w:tc>
-        <w:tc>
-          <w:tcPr>
-            <w:tcMar>
-              <w:top w:w="80.0" w:type="dxa"/>
-              <w:left w:w="100.0" w:type="dxa"/>
-              <w:bottom w:w="80.0" w:type="dxa"/>
-              <w:right w:w="100.0" w:type="dxa"/>
-            </w:tcMar>
-          </w:tcPr>
-          <w:p>
-            <w:pPr>
-              <w:rPr>
-                <w:rFonts w:ascii="Arial" w:cs="Arial" w:eastAsia="Arial" w:hAnsi="Arial"/>
-                <w:sz w:val="34"/>
-                <w:szCs w:val="34"/>
-              </w:rPr>
-            </w:pPr>
-            <w:r>
-              <w:rPr>
-                <w:rFonts w:ascii="Arial" w:cs="Arial" w:eastAsia="Arial" w:hAnsi="Arial"/>
-                <w:color w:val="1b1b1b"/>
-                <w:sz w:val="21"/>
-                <w:szCs w:val="21"/>
-                <w:rtl w:val="0"/>
-              </w:rPr>
-              <w:t xml:space="preserve">Baja: no resulta idónea para sistemas POS/ERP con control estricto de inventarios.</w:t>
-            </w:r>
-            <w:r>
-              <w:rPr>
-                <w:rtl w:val="0"/>
-              </w:rPr>
-            </w:r>
-          </w:p>
-        </w:tc>
-      </w:tr>
-      <w:tr>
-        <w:trPr>
-          <w:cantSplit w:val="0"/>
-          <w:tblHeader w:val="0"/>
-        </w:trPr>
-        <w:tc>
-          <w:tcPr>
-            <w:tcMar>
-              <w:top w:w="80.0" w:type="dxa"/>
-              <w:left w:w="100.0" w:type="dxa"/>
-              <w:bottom w:w="80.0" w:type="dxa"/>
-              <w:right w:w="100.0" w:type="dxa"/>
-            </w:tcMar>
-          </w:tcPr>
-          <w:p>
-            <w:pPr>
-              <w:rPr>
-                <w:rFonts w:ascii="Arial" w:cs="Arial" w:eastAsia="Arial" w:hAnsi="Arial"/>
-                <w:sz w:val="34"/>
-                <w:szCs w:val="34"/>
-              </w:rPr>
-            </w:pPr>
-            <w:r>
-              <w:rPr>
-                <w:rFonts w:ascii="Arial" w:cs="Arial" w:eastAsia="Arial" w:hAnsi="Arial"/>
-                <w:color w:val="1b1b1b"/>
-                <w:sz w:val="21"/>
-                <w:szCs w:val="21"/>
-                <w:rtl w:val="0"/>
-              </w:rPr>
               <w:t xml:space="preserve">Microsoft SQL Server / Oracle</w:t>
             </w:r>
             <w:r>
@@ -2412,8 +2236,28 @@
           <w:szCs w:val="25"/>
         </w:rPr>
       </w:pPr>
-      <w:bookmarkStart w:colFirst="0" w:colLast="0" w:name="_a3y622rhjo8z" w:id="3"/>
+      <w:bookmarkStart w:colFirst="0" w:colLast="0" w:name="_9dhh35wptm0h" w:id="3"/>
       <w:bookmarkEnd w:id="3"/>
+      <w:r>
+        <w:rPr>
+          <w:rtl w:val="0"/>
+        </w:rPr>
+      </w:r>
+    </w:p>
+    <w:p>
+      <w:pPr>
+        <w:rPr/>
+      </w:pPr>
+      <w:r>
+        <w:rPr>
+          <w:rtl w:val="0"/>
+        </w:rPr>
+      </w:r>
+    </w:p>
+    <w:p>
+      <w:pPr>
+        <w:rPr/>
+      </w:pPr>
       <w:r>
         <w:rPr>
           <w:rtl w:val="0"/>

</xml_diff>